<commit_message>
Photo reports: signature at the end, no empty row; letterhead on CD renewal
- Photo reports: the stamp & signature goes at the bottom of the last
  remaining page (new stamp option page: "last"; in Word it is anchored to
  the last paragraph). The thin empty band under each photo's details table
  is gone (trailing paragraph made 1 pt, row height no longer fixed).
  Templates v3.
- Owner undertaking for the Civil Defence renewal had no letterhead in the
  original; a new copy_header op adds the ACAD letterhead from another
  reference letter. Template v2.

Co-Authored-By: Claude Opus 5.5 <noreply@anthropic.com>
Claude-Session: https://claude.ai/code/session_01KhB95Q3CdNoHoGHNq4XQ7x
</commit_message>
<xml_diff>
--- a/templates/dist/owner-undertaking-cd-renewal.docx
+++ b/templates/dist/owner-undertaking-cd-renewal.docx
@@ -953,6 +953,7 @@
       </w:r>
     </w:p>
     <w:sectPr>
+      <w:headerReference w:type="default" r:id="rIdAcadHdr1"/>
       <w:footerReference w:type="default" r:id="rId7"/>
       <w:pgSz w:w="11906" w:h="16838" w:code="9"/>
       <w:pgMar w:top="360" w:right="1196" w:bottom="8" w:left="1800" w:header="720" w:footer="720" w:gutter="0"/>
@@ -1064,6 +1065,76 @@
     </w:p>
   </w:footnote>
 </w:footnotes>
+</file>
+
+<file path=word/header1.xml><?xml version="1.0" encoding="utf-8"?>
+<w:hdr xmlns:wpc="http://schemas.microsoft.com/office/word/2010/wordprocessingCanvas" xmlns:cx="http://schemas.microsoft.com/office/drawing/2014/chartex" xmlns:cx1="http://schemas.microsoft.com/office/drawing/2015/9/8/chartex" xmlns:cx2="http://schemas.microsoft.com/office/drawing/2015/10/21/chartex" xmlns:cx3="http://schemas.microsoft.com/office/drawing/2016/5/9/chartex" xmlns:cx4="http://schemas.microsoft.com/office/drawing/2016/5/10/chartex" xmlns:cx5="http://schemas.microsoft.com/office/drawing/2016/5/11/chartex" xmlns:cx6="http://schemas.microsoft.com/office/drawing/2016/5/12/chartex" xmlns:cx7="http://schemas.microsoft.com/office/drawing/2016/5/13/chartex" xmlns:cx8="http://schemas.microsoft.com/office/drawing/2016/5/14/chartex" xmlns:mc="http://schemas.openxmlformats.org/markup-compatibility/2006" xmlns:aink="http://schemas.microsoft.com/office/drawing/2016/ink" xmlns:am3d="http://schemas.microsoft.com/office/drawing/2017/model3d" xmlns:o="urn:schemas-microsoft-com:office:office" xmlns:oel="http://schemas.microsoft.com/office/2019/extlst" xmlns:r="http://schemas.openxmlformats.org/officeDocument/2006/relationships" xmlns:m="http://schemas.openxmlformats.org/officeDocument/2006/math" xmlns:v="urn:schemas-microsoft-com:vml" xmlns:wp14="http://schemas.microsoft.com/office/word/2010/wordprocessingDrawing" xmlns:wp="http://schemas.openxmlformats.org/drawingml/2006/wordprocessingDrawing" xmlns:w10="urn:schemas-microsoft-com:office:word" xmlns:w="http://schemas.openxmlformats.org/wordprocessingml/2006/main" xmlns:w14="http://schemas.microsoft.com/office/word/2010/wordml" xmlns:w15="http://schemas.microsoft.com/office/word/2012/wordml" xmlns:w16cex="http://schemas.microsoft.com/office/word/2018/wordml/cex" xmlns:w16cid="http://schemas.microsoft.com/office/word/2016/wordml/cid" xmlns:w16="http://schemas.microsoft.com/office/word/2018/wordml" xmlns:w16du="http://schemas.microsoft.com/office/word/2023/wordml/word16du" xmlns:w16sdtdh="http://schemas.microsoft.com/office/word/2020/wordml/sdtdatahash" xmlns:w16sdtfl="http://schemas.microsoft.com/office/word/2024/wordml/sdtformatlock" xmlns:w16se="http://schemas.microsoft.com/office/word/2015/wordml/symex" xmlns:wpg="http://schemas.microsoft.com/office/word/2010/wordprocessingGroup" xmlns:wpi="http://schemas.microsoft.com/office/word/2010/wordprocessingInk" xmlns:wne="http://schemas.microsoft.com/office/word/2006/wordml" xmlns:wps="http://schemas.microsoft.com/office/word/2010/wordprocessingShape" mc:Ignorable="w14 w15 w16se w16cid w16 w16cex w16sdtdh w16sdtfl w16du wp14">
+  <w:p>
+    <w:pPr>
+      <w:pStyle w:val="Header"/>
+    </w:pPr>
+    <w:r>
+      <w:rPr>
+        <w:noProof/>
+      </w:rPr>
+      <w:drawing>
+        <wp:anchor distT="0" distB="0" distL="114300" distR="114300" simplePos="0" relativeHeight="251658240" behindDoc="1" locked="0" layoutInCell="1" allowOverlap="1" wp14:anchorId="3656E534" wp14:editId="6E1920DC">
+          <wp:simplePos x="0" y="0"/>
+          <wp:positionH relativeFrom="column">
+            <wp:posOffset>-1162050</wp:posOffset>
+          </wp:positionH>
+          <wp:positionV relativeFrom="paragraph">
+            <wp:posOffset>-466725</wp:posOffset>
+          </wp:positionV>
+          <wp:extent cx="7562850" cy="10668000"/>
+          <wp:effectExtent l="0" t="0" r="0" b="0"/>
+          <wp:wrapNone/>
+          <wp:docPr id="1594323184" name="Picture 1"/>
+          <wp:cNvGraphicFramePr>
+            <a:graphicFrameLocks xmlns:a="http://schemas.openxmlformats.org/drawingml/2006/main" noChangeAspect="1"/>
+          </wp:cNvGraphicFramePr>
+          <a:graphic xmlns:a="http://schemas.openxmlformats.org/drawingml/2006/main">
+            <a:graphicData uri="http://schemas.openxmlformats.org/drawingml/2006/picture">
+              <pic:pic xmlns:pic="http://schemas.openxmlformats.org/drawingml/2006/picture">
+                <pic:nvPicPr>
+                  <pic:cNvPr id="1594323184" name="Picture 1594323184"/>
+                  <pic:cNvPicPr/>
+                </pic:nvPicPr>
+                <pic:blipFill>
+                  <a:blip r:embed="rId1">
+                    <a:extLst>
+                      <a:ext uri="{28A0092B-C50C-407E-A947-70E740481C1C}">
+                        <a14:useLocalDpi xmlns:a14="http://schemas.microsoft.com/office/drawing/2010/main" val="0"/>
+                      </a:ext>
+                    </a:extLst>
+                  </a:blip>
+                  <a:stretch>
+                    <a:fillRect/>
+                  </a:stretch>
+                </pic:blipFill>
+                <pic:spPr>
+                  <a:xfrm>
+                    <a:off x="0" y="0"/>
+                    <a:ext cx="7562850" cy="10668000"/>
+                  </a:xfrm>
+                  <a:prstGeom prst="rect">
+                    <a:avLst/>
+                  </a:prstGeom>
+                </pic:spPr>
+              </pic:pic>
+            </a:graphicData>
+          </a:graphic>
+          <wp14:sizeRelH relativeFrom="margin">
+            <wp14:pctWidth>0</wp14:pctWidth>
+          </wp14:sizeRelH>
+          <wp14:sizeRelV relativeFrom="margin">
+            <wp14:pctHeight>0</wp14:pctHeight>
+          </wp14:sizeRelV>
+        </wp:anchor>
+      </w:drawing>
+    </w:r>
+  </w:p>
+</w:hdr>
 </file>
 
 <file path=word/numbering.xml><?xml version="1.0" encoding="utf-8"?>

</xml_diff>

<commit_message>
CD Estifaa renewal undertaking: no ACAD letterhead
The owner's undertaking is not an ACAD letter; the letterhead copied in from
another letter is removed (v3, so browsers load the new file).

Co-Authored-By: Claude Opus 5.5 <noreply@anthropic.com>
Claude-Session: https://claude.ai/code/session_01KhB95Q3CdNoHoGHNq4XQ7x
</commit_message>
<xml_diff>
--- a/templates/dist/owner-undertaking-cd-renewal.docx
+++ b/templates/dist/owner-undertaking-cd-renewal.docx
@@ -279,6 +279,7 @@
     </w:p>
     <w:tbl>
       <w:tblPr>
+        <w:bidiVisual w:val="0"/>
         <w:tblW w:w="10741" w:type="dxa"/>
         <w:tblInd w:w="-1222" w:type="dxa"/>
         <w:tblBorders>
@@ -953,7 +954,6 @@
       </w:r>
     </w:p>
     <w:sectPr>
-      <w:headerReference w:type="default" r:id="rIdAcadHdr1"/>
       <w:footerReference w:type="default" r:id="rId7"/>
       <w:pgSz w:w="11906" w:h="16838" w:code="9"/>
       <w:pgMar w:top="360" w:right="1196" w:bottom="8" w:left="1800" w:header="720" w:footer="720" w:gutter="0"/>
@@ -1065,76 +1065,6 @@
     </w:p>
   </w:footnote>
 </w:footnotes>
-</file>
-
-<file path=word/header1.xml><?xml version="1.0" encoding="utf-8"?>
-<w:hdr xmlns:wpc="http://schemas.microsoft.com/office/word/2010/wordprocessingCanvas" xmlns:cx="http://schemas.microsoft.com/office/drawing/2014/chartex" xmlns:cx1="http://schemas.microsoft.com/office/drawing/2015/9/8/chartex" xmlns:cx2="http://schemas.microsoft.com/office/drawing/2015/10/21/chartex" xmlns:cx3="http://schemas.microsoft.com/office/drawing/2016/5/9/chartex" xmlns:cx4="http://schemas.microsoft.com/office/drawing/2016/5/10/chartex" xmlns:cx5="http://schemas.microsoft.com/office/drawing/2016/5/11/chartex" xmlns:cx6="http://schemas.microsoft.com/office/drawing/2016/5/12/chartex" xmlns:cx7="http://schemas.microsoft.com/office/drawing/2016/5/13/chartex" xmlns:cx8="http://schemas.microsoft.com/office/drawing/2016/5/14/chartex" xmlns:mc="http://schemas.openxmlformats.org/markup-compatibility/2006" xmlns:aink="http://schemas.microsoft.com/office/drawing/2016/ink" xmlns:am3d="http://schemas.microsoft.com/office/drawing/2017/model3d" xmlns:o="urn:schemas-microsoft-com:office:office" xmlns:oel="http://schemas.microsoft.com/office/2019/extlst" xmlns:r="http://schemas.openxmlformats.org/officeDocument/2006/relationships" xmlns:m="http://schemas.openxmlformats.org/officeDocument/2006/math" xmlns:v="urn:schemas-microsoft-com:vml" xmlns:wp14="http://schemas.microsoft.com/office/word/2010/wordprocessingDrawing" xmlns:wp="http://schemas.openxmlformats.org/drawingml/2006/wordprocessingDrawing" xmlns:w10="urn:schemas-microsoft-com:office:word" xmlns:w="http://schemas.openxmlformats.org/wordprocessingml/2006/main" xmlns:w14="http://schemas.microsoft.com/office/word/2010/wordml" xmlns:w15="http://schemas.microsoft.com/office/word/2012/wordml" xmlns:w16cex="http://schemas.microsoft.com/office/word/2018/wordml/cex" xmlns:w16cid="http://schemas.microsoft.com/office/word/2016/wordml/cid" xmlns:w16="http://schemas.microsoft.com/office/word/2018/wordml" xmlns:w16du="http://schemas.microsoft.com/office/word/2023/wordml/word16du" xmlns:w16sdtdh="http://schemas.microsoft.com/office/word/2020/wordml/sdtdatahash" xmlns:w16sdtfl="http://schemas.microsoft.com/office/word/2024/wordml/sdtformatlock" xmlns:w16se="http://schemas.microsoft.com/office/word/2015/wordml/symex" xmlns:wpg="http://schemas.microsoft.com/office/word/2010/wordprocessingGroup" xmlns:wpi="http://schemas.microsoft.com/office/word/2010/wordprocessingInk" xmlns:wne="http://schemas.microsoft.com/office/word/2006/wordml" xmlns:wps="http://schemas.microsoft.com/office/word/2010/wordprocessingShape" mc:Ignorable="w14 w15 w16se w16cid w16 w16cex w16sdtdh w16sdtfl w16du wp14">
-  <w:p>
-    <w:pPr>
-      <w:pStyle w:val="Header"/>
-    </w:pPr>
-    <w:r>
-      <w:rPr>
-        <w:noProof/>
-      </w:rPr>
-      <w:drawing>
-        <wp:anchor distT="0" distB="0" distL="114300" distR="114300" simplePos="0" relativeHeight="251658240" behindDoc="1" locked="0" layoutInCell="1" allowOverlap="1" wp14:anchorId="3656E534" wp14:editId="6E1920DC">
-          <wp:simplePos x="0" y="0"/>
-          <wp:positionH relativeFrom="column">
-            <wp:posOffset>-1162050</wp:posOffset>
-          </wp:positionH>
-          <wp:positionV relativeFrom="paragraph">
-            <wp:posOffset>-466725</wp:posOffset>
-          </wp:positionV>
-          <wp:extent cx="7562850" cy="10668000"/>
-          <wp:effectExtent l="0" t="0" r="0" b="0"/>
-          <wp:wrapNone/>
-          <wp:docPr id="1594323184" name="Picture 1"/>
-          <wp:cNvGraphicFramePr>
-            <a:graphicFrameLocks xmlns:a="http://schemas.openxmlformats.org/drawingml/2006/main" noChangeAspect="1"/>
-          </wp:cNvGraphicFramePr>
-          <a:graphic xmlns:a="http://schemas.openxmlformats.org/drawingml/2006/main">
-            <a:graphicData uri="http://schemas.openxmlformats.org/drawingml/2006/picture">
-              <pic:pic xmlns:pic="http://schemas.openxmlformats.org/drawingml/2006/picture">
-                <pic:nvPicPr>
-                  <pic:cNvPr id="1594323184" name="Picture 1594323184"/>
-                  <pic:cNvPicPr/>
-                </pic:nvPicPr>
-                <pic:blipFill>
-                  <a:blip r:embed="rId1">
-                    <a:extLst>
-                      <a:ext uri="{28A0092B-C50C-407E-A947-70E740481C1C}">
-                        <a14:useLocalDpi xmlns:a14="http://schemas.microsoft.com/office/drawing/2010/main" val="0"/>
-                      </a:ext>
-                    </a:extLst>
-                  </a:blip>
-                  <a:stretch>
-                    <a:fillRect/>
-                  </a:stretch>
-                </pic:blipFill>
-                <pic:spPr>
-                  <a:xfrm>
-                    <a:off x="0" y="0"/>
-                    <a:ext cx="7562850" cy="10668000"/>
-                  </a:xfrm>
-                  <a:prstGeom prst="rect">
-                    <a:avLst/>
-                  </a:prstGeom>
-                </pic:spPr>
-              </pic:pic>
-            </a:graphicData>
-          </a:graphic>
-          <wp14:sizeRelH relativeFrom="margin">
-            <wp14:pctWidth>0</wp14:pctWidth>
-          </wp14:sizeRelH>
-          <wp14:sizeRelV relativeFrom="margin">
-            <wp14:pctHeight>0</wp14:pctHeight>
-          </wp14:sizeRelV>
-        </wp:anchor>
-      </w:drawing>
-    </w:r>
-  </w:p>
-</w:hdr>
 </file>
 
 <file path=word/numbering.xml><?xml version="1.0" encoding="utf-8"?>

</xml_diff>